<commit_message>
Add STRAT-NSCC-01 v2.0; update CI-ENFORCE-01 to include STRAT-NSCC-01 exposure assessment
New document:
- STRAT-NSCC-01: Operational strategy memorandum — exploitation of PRC
  defense-industrial intelligence and calibration of U.S. enforcement
  architecture. Three LOEs (financial intelligence targeting, export control
  recalibration, diplomatic multilateralization), 12 actions mapped to
  statutory authorities, decision matrix, risk register, source reliability
  appendix (Annex C). Responds to publicly reported NSCC Tianjin breach.

Updated document:
- CI-ENFORCE-01: Scope expanded from 6 to 7 documents. New Section 1.4
  assesses STRAT-NSCC-01 CI exposure (Moderate). PRC adversary utility
  section updated. Consolidated risk matrix row added. Recommendations
  and final judgment updated.
</commit_message>
<xml_diff>
--- a/00-governance/WP-2026-CI-ENFORCE-01.docx
+++ b/00-governance/WP-2026-CI-ENFORCE-01.docx
@@ -63,7 +63,7 @@
           <w:sz w:val="26"/>
           <w:szCs w:val="26"/>
         </w:rPr>
-        <w:t xml:space="preserve">UNIFIED-01, CTF-01, CPF-02, ARCH-03, NUC-01, CYBER-01</w:t>
+        <w:t xml:space="preserve">UNIFIED-01, CTF-01, CPF-02, ARCH-03, NUC-01, CYBER-01, STRAT-NSCC-01</w:t>
       </w:r>
     </w:p>
     <w:p>
@@ -172,7 +172,7 @@
           <w:sz w:val="20"/>
           <w:szCs w:val="20"/>
         </w:rPr>
-        <w:t xml:space="preserve">Independent policy research. Open-source CI exposure methodology applied to six newly deployed WP-2026 series documents. No classified information used or referenced. Adversary utility assessments are analytically inferred from document content and known adversary OSINT collection practices — not intelligence reporting. These documents are published on GitHub and should be treated as already collected by adversary OSINT programs. This assessment supplements WP-2026-CI-Assessment v3.0 (series-level). Assessment methodology follows MAP-CI-01 five-dimension framework adapted for document-based products.</w:t>
+        <w:t xml:space="preserve">Independent policy research. Open-source CI exposure methodology applied to seven newly deployed WP-2026 series documents. No classified information used or referenced. Adversary utility assessments are analytically inferred from document content and known adversary OSINT collection practices — not intelligence reporting. These documents are published on GitHub and should be treated as already collected by adversary OSINT programs. This assessment supplements WP-2026-CI-Assessment v3.0 (series-level). Assessment methodology follows MAP-CI-01 five-dimension framework adapted for document-based products.</w:t>
       </w:r>
     </w:p>
     <w:p>
@@ -203,7 +203,7 @@
           <w:szCs w:val="22"/>
           <w:color w:val="000000"/>
         </w:rPr>
-        <w:t xml:space="preserve">Counterintelligence exposure assessment of six WP-2026 series documents deployed in April 2026: the enforcement architecture suite (UNIFIED-01, CTF-01, CPF-02, ARCH-03) and two infrastructure policy papers (NUC-01, CYBER-01). Applies the five-dimension CI exposure methodology established in WP-2026-MAP-CI-01, adapted for document-based products. Assesses enforcement logic disclosure, evidentiary gap disclosure, litigation vulnerability mapping, institutional capacity constraint disclosure, and GitHub hosting exposure. Finds: legal exposure very low (no statute applicable; First Amendment fully protective); highest CI-significant content is the Principal Legal Risks sections providing pre-built defensive litigation maps; NUC-01 and CYBER-01 present lower exposure (aggregation of publicly available data only). Supplements WP-2026-CI-Assessment v3.0 (series-level). All analysis based on open-source data only.</w:t>
+        <w:t xml:space="preserve">Counterintelligence exposure assessment of seven WP-2026 series documents deployed in April 2026: the enforcement architecture suite (UNIFIED-01, CTF-01, CPF-02, ARCH-03), two infrastructure policy papers (NUC-01, CYBER-01), and one operational strategy memorandum (STRAT-NSCC-01). Applies the five-dimension CI exposure methodology established in WP-2026-MAP-CI-01, adapted for document-based products. Assesses enforcement logic disclosure, evidentiary gap disclosure, litigation vulnerability mapping, institutional capacity constraint disclosure, and GitHub hosting exposure. Finds: legal exposure very low (no statute applicable; First Amendment fully protective); highest CI-significant content is the Principal Legal Risks sections providing pre-built defensive litigation maps; NUC-01, CYBER-01, and STRAT-NSCC-01 present lower exposure (aggregation of publicly available data only, with STRAT-NSCC-01 presenting a distinct exposure profile as an event-driven enforcement calibration memo responding to publicly reported PRC data breach). Supplements WP-2026-CI-Assessment v3.0 (series-level). All analysis based on open-source data only.</w:t>
       </w:r>
     </w:p>
     <w:p>
@@ -461,7 +461,7 @@
                 <w:sz w:val="20"/>
                 <w:szCs w:val="20"/>
               </w:rPr>
-              <w:t xml:space="preserve">The legal exposure of all six documents is assessed as very low — identical to the WP-2026-CI-Assessment v3.0 determination. All content is derived from publicly available statutory text, published government assessments, open-source enforcement precedent, and publicly available energy and cybersecurity data. No National Defense Information element is satisfied. First Amendment protections apply at the highest level for policy commentary on matters of public concern.</w:t>
+              <w:t xml:space="preserve">The legal exposure of all seven documents is assessed as very low — identical to the WP-2026-CI-Assessment v3.0 determination. All content is derived from publicly available statutory text, published government assessments, open-source enforcement precedent, and publicly available energy and cybersecurity data. No National Defense Information element is satisfied. First Amendment protections apply at the highest level for policy commentary on matters of public concern.</w:t>
             </w:r>
           </w:p>
           <w:p>
@@ -721,7 +721,7 @@
                 <w:sz w:val="20"/>
                 <w:szCs w:val="20"/>
               </w:rPr>
-              <w:t xml:space="preserve">NUC-01 and CYBER-01 present lower CI exposure than the enforcement suite. These documents analyze publicly reported U.S. infrastructure constraints and policy gaps using exclusively Tier 1/2 public sources. Adversary utility is limited to confirmation of publicly available assessments rather than novel disclosure. The principal CI exposure is the aggregation of constraint analysis into actionable vulnerability assessments — the papers identify specific bottlenecks (HALEU supply chain, CISA staffing gaps, transmission interconnection queues) that an adversary could use to calibrate infrastructure targeting or influence operations.</w:t>
+              <w:t xml:space="preserve">NUC-01, CYBER-01, and STRAT-NSCC-01 present lower CI exposure than the enforcement suite. These documents analyze publicly reported U.S. infrastructure constraints, policy gaps, and PRC defense-industrial indicators using exclusively Tier 1/2 public sources. Adversary utility is limited to confirmation of publicly available assessments rather than novel disclosure. The principal CI exposure is the aggregation of constraint analysis into actionable assessments — the papers identify specific bottlenecks (HALEU supply chain, CISA staffing gaps, transmission interconnection queues) and enforcement calibration actions that an adversary could use to calibrate infrastructure targeting, influence operations, or enforcement evasion strategies. STRAT-NSCC-01 presents a distinct exposure profile: its enforcement recommendations, if adopted, would directly affect PRC procurement network operations, and its source reliability appendix explicitly discloses the evidentiary ceiling of the analysis.</w:t>
             </w:r>
           </w:p>
           <w:p>
@@ -1731,8 +1731,8 @@
     </w:p>
     <w:p>
       <w:pPr>
-        <w:pStyle w:val="Heading1"/>
-        <w:spacing w:after="200" w:before="360"/>
+        <w:pStyle w:val="Heading2"/>
+        <w:spacing w:after="160" w:before="280"/>
       </w:pPr>
       <w:r>
         <w:rPr>
@@ -1740,27 +1740,59 @@
           <w:b/>
           <w:bCs/>
           <w:color w:val="1B2A4A"/>
-          <w:sz w:val="30"/>
-          <w:szCs w:val="30"/>
-        </w:rPr>
-        <w:t xml:space="preserve">Part II — Adversary-Specific Utility Assessment</w:t>
-      </w:r>
-    </w:p>
-    <w:p>
-      <w:pPr>
-        <w:pStyle w:val="Heading2"/>
-        <w:spacing w:after="160" w:before="280"/>
+          <w:sz w:val="26"/>
+          <w:szCs w:val="26"/>
+        </w:rPr>
+        <w:t xml:space="preserve">1.4 STRAT-NSCC-01 (Exploitation of PRC Defense-Industrial Intelligence and Calibration of U.S. Enforcement Architecture)</w:t>
+      </w:r>
+    </w:p>
+    <w:p>
+      <w:pPr>
+        <w:spacing w:after="120" w:line="276"/>
+      </w:pPr>
+      <w:r>
+        <w:rPr>
+          <w:rFonts w:ascii="Arial" w:cs="Arial" w:eastAsia="Arial" w:hAnsi="Arial"/>
+          <w:sz w:val="22"/>
+          <w:szCs w:val="22"/>
+        </w:rPr>
+        <w:t xml:space="preserve">CI exposure profile: Moderate.</w:t>
+      </w:r>
+    </w:p>
+    <w:p>
+      <w:pPr>
+        <w:spacing w:after="120" w:line="276"/>
+      </w:pPr>
+      <w:r>
+        <w:rPr>
+          <w:rFonts w:ascii="Arial" w:cs="Arial" w:eastAsia="Arial" w:hAnsi="Arial"/>
+          <w:sz w:val="22"/>
+          <w:szCs w:val="22"/>
+        </w:rPr>
+        <w:t xml:space="preserve">STRAT-NSCC-01 is an event-driven operational strategy memorandum responding to the publicly reported FlamingChina breach of China’s National Supercomputing Center (NSCC) in Tianjin. It proposes twelve enforcement calibration actions across three Lines of Effort (Financial Intelligence Targeting, Export Control Recalibration, Diplomatic Multilateralization), with all actions mapped to specific U.S. statutory authorities. The document explicitly identifies itself as open-source analysis and includes a Source Reliability and Bibliography appendix (Annex C) that transparently discloses its 20 unique sources and the concentration of its predicate-event reporting tier.</w:t>
+      </w:r>
+    </w:p>
+    <w:p>
+      <w:pPr>
+        <w:spacing w:after="120" w:line="276"/>
       </w:pPr>
       <w:r>
         <w:rPr>
           <w:rFonts w:ascii="Arial" w:cs="Arial" w:eastAsia="Arial" w:hAnsi="Arial"/>
           <w:b/>
           <w:bCs/>
-          <w:color w:val="1B2A4A"/>
-          <w:sz w:val="24"/>
-          <w:szCs w:val="24"/>
-        </w:rPr>
-        <w:t xml:space="preserve">2.1 Russia — SVR / FSB / GRU OSINT Collection</w:t>
+          <w:sz w:val="22"/>
+          <w:szCs w:val="22"/>
+        </w:rPr>
+        <w:t xml:space="preserve">Exposure Dimension 1: Enforcement Calibration Logic.</w:t>
+      </w:r>
+      <w:r>
+        <w:rPr>
+          <w:rFonts w:ascii="Arial" w:cs="Arial" w:eastAsia="Arial" w:hAnsi="Arial"/>
+          <w:sz w:val="22"/>
+          <w:szCs w:val="22"/>
+        </w:rPr>
+        <w:t xml:space="preserve"> The memorandum discloses how the U.S. enforcement architecture could be recalibrated in response to a specific intelligence event — including which authorities are immediately executable under existing delegations (11 of 12 actions), which require presidential decision (1 action), and which interagency synchronization gaps create enforcement lag. A PRC adversary reading the decision matrix receives a clear map of the U.S. enforcement response timeline and the distinction between 90-day, 180-day, and 360-day action sets.</w:t>
       </w:r>
     </w:p>
     <w:p>
@@ -1770,10 +1802,66 @@
       <w:r>
         <w:rPr>
           <w:rFonts w:ascii="Arial" w:cs="Arial" w:eastAsia="Arial" w:hAnsi="Arial"/>
-          <w:sz w:val="22"/>
-          <w:szCs w:val="22"/>
-        </w:rPr>
-        <w:t xml:space="preserve">Russian adversary utility from the enforcement suite is assessed as moderate and concentrated in CPF-02. The CAATSA/CISADA secondary sanctions framework, maritime de-flagging enforcement mechanism, and semiconductor supply chain chokepoint analysis directly address Russian evasion infrastructure. The Principal Legal Risks sections for maritime de-flagging and secondary sanctions disclose the specific legal vulnerabilities Russia’s legal counsel could exploit (registry sovereignty, proportionality, diplomatic escalation leverage). The NUC-01 HALEU supply chain analysis also identifies Russian leverage points in the U.S. nuclear fuel cycle (Rosatom/TENEX dependence).</w:t>
+          <w:b/>
+          <w:bCs/>
+          <w:sz w:val="22"/>
+          <w:szCs w:val="22"/>
+        </w:rPr>
+        <w:t xml:space="preserve">Exposure Dimension 2: Transshipment Node Identification.</w:t>
+      </w:r>
+      <w:r>
+        <w:rPr>
+          <w:rFonts w:ascii="Arial" w:cs="Arial" w:eastAsia="Arial" w:hAnsi="Arial"/>
+          <w:sz w:val="22"/>
+          <w:szCs w:val="22"/>
+        </w:rPr>
+        <w:t xml:space="preserve"> The memorandum explicitly names Singapore, UAE, and Malaysia as priority transshipment nodes for PRC defense-industrial procurement evasion. While this characterization is based on publicly reported BIS enforcement actions and is not novel, the aggregation into a prioritized enforcement targeting list with specific diplomatic timelines and observable behavioral indicators provides operational structure that an adversary could use to pre-position evasion activity in alternative jurisdictions.</w:t>
+      </w:r>
+    </w:p>
+    <w:p>
+      <w:pPr>
+        <w:spacing w:after="120" w:line="276"/>
+      </w:pPr>
+      <w:r>
+        <w:rPr>
+          <w:rFonts w:ascii="Arial" w:cs="Arial" w:eastAsia="Arial" w:hAnsi="Arial"/>
+          <w:b/>
+          <w:bCs/>
+          <w:sz w:val="22"/>
+          <w:szCs w:val="22"/>
+        </w:rPr>
+        <w:t xml:space="preserve">Exposure Dimension 3: Source Ceiling Transparency.</w:t>
+      </w:r>
+      <w:r>
+        <w:rPr>
+          <w:rFonts w:ascii="Arial" w:cs="Arial" w:eastAsia="Arial" w:hAnsi="Arial"/>
+          <w:sz w:val="22"/>
+          <w:szCs w:val="22"/>
+        </w:rPr>
+        <w:t xml:space="preserve"> Annex C (Source Reliability and Bibliography) explicitly discloses that the document’s predicate-event reporting tier consists of three news outlets reporting on unverified breach claims, with a single Substack post (NetAskari) providing the only detailed sample interpretation. This transparency is methodologically correct but functions as an adversary confidence calibration tool — analogous to the Scope Limitations exposure identified in KJ-5 of this assessment. An adversary analyst reading Annex C can immediately identify which analytical claims in the memorandum rest on the thinnest evidentiary foundation.</w:t>
+      </w:r>
+    </w:p>
+    <w:p>
+      <w:pPr>
+        <w:spacing w:after="120" w:line="276"/>
+      </w:pPr>
+      <w:r>
+        <w:rPr>
+          <w:rFonts w:ascii="Arial" w:cs="Arial" w:eastAsia="Arial" w:hAnsi="Arial"/>
+          <w:b/>
+          <w:bCs/>
+          <w:sz w:val="22"/>
+          <w:szCs w:val="22"/>
+        </w:rPr>
+        <w:t xml:space="preserve">Exposure Dimension 4: Counterintelligence Risk Self-Assessment.</w:t>
+      </w:r>
+      <w:r>
+        <w:rPr>
+          <w:rFonts w:ascii="Arial" w:cs="Arial" w:eastAsia="Arial" w:hAnsi="Arial"/>
+          <w:sz w:val="22"/>
+          <w:szCs w:val="22"/>
+        </w:rPr>
+        <w:t xml:space="preserve"> The memorandum includes an internal CI risk section that explicitly identifies the possibility that the NSCC breach data may constitute a controlled leak or deception operation and segregates enforcement calibration actions (justified regardless of breach authenticity) from force posture adaptations (dependent on parameter validity). This is the correct CI methodology. However, the Annex B force posture section — even with its explicit illustrative caveat — partially undermines this segregation by discussing defense simulation scenarios derived from potentially manipulated data. The document acknowledges this tension through its caveat architecture.</w:t>
       </w:r>
     </w:p>
     <w:p>
@@ -1794,7 +1882,7 @@
           <w:sz w:val="20"/>
           <w:szCs w:val="20"/>
         </w:rPr>
-        <w:t xml:space="preserve">ASSESSED UTILITY: </w:t>
+        <w:t xml:space="preserve">ASSESSED ADVERSARY UTILITY: </w:t>
       </w:r>
       <w:r>
         <w:rPr>
@@ -1802,7 +1890,24 @@
           <w:sz w:val="20"/>
           <w:szCs w:val="20"/>
         </w:rPr>
-        <w:t xml:space="preserve">Moderate. CPF-02 litigation risks and evasion pathway analysis are the highest-value content. NUC-01 HALEU analysis confirms publicly reported dependence.</w:t>
+        <w:t xml:space="preserve">Moderate. Higher than NUC-01 and CYBER-01 because the enforcement calibration logic, transshipment node prioritization, and decision matrix timelines have direct operational relevance to PRC procurement network adaptation. Lower than the enforcement architecture suite because STRAT-NSCC-01 describes enforcement calibration at the policy-recommendation level rather than the mechanism-specific level of CTF-01/CPF-02/ARCH-03. The document’s primary CI mitigant is that its enforcement recommendations operate through structural legal authority and institutional capacity, not information asymmetry — knowing the recommended enforcement recalibration does not transfer the OFAC, BIS, or FinCEN authority required to execute it.</w:t>
+      </w:r>
+    </w:p>
+    <w:p>
+      <w:pPr>
+        <w:pStyle w:val="Heading1"/>
+        <w:spacing w:after="200" w:before="360"/>
+      </w:pPr>
+      <w:r>
+        <w:rPr>
+          <w:rFonts w:ascii="Arial" w:cs="Arial" w:eastAsia="Arial" w:hAnsi="Arial"/>
+          <w:b/>
+          <w:bCs/>
+          <w:color w:val="1B2A4A"/>
+          <w:sz w:val="30"/>
+          <w:szCs w:val="30"/>
+        </w:rPr>
+        <w:t xml:space="preserve">Part II — Adversary-Specific Utility Assessment</w:t>
       </w:r>
     </w:p>
     <w:p>
@@ -1819,7 +1924,7 @@
           <w:sz w:val="24"/>
           <w:szCs w:val="24"/>
         </w:rPr>
-        <w:t xml:space="preserve">2.2 People’s Republic of China — MSS</w:t>
+        <w:t xml:space="preserve">2.1 Russia — SVR / FSB / GRU OSINT Collection</w:t>
       </w:r>
     </w:p>
     <w:p>
@@ -1832,7 +1937,7 @@
           <w:sz w:val="22"/>
           <w:szCs w:val="22"/>
         </w:rPr>
-        <w:t xml:space="preserve">PRC adversary utility is assessed as moderate and concentrated in the enforcement suite’s treatment of PRC-domiciled banks. ARCH-03 and CPF-02 explicitly analyze § 981(k) asset substitution authority against PRC correspondent accounts, FSIA sovereign immunity defenses for PRC state-owned banks, and PRC anti-sanctions legislation as a conflict-of-law defense. The Key Unknowns sections explicitly identify PRC enforcement cooperation thresholds and secondary sanctions absorption capacity as unestablished — disclosing the precise uncertainty boundary the U.S. enforcement architecture cannot resolve from public sources.</w:t>
+        <w:t xml:space="preserve">Russian adversary utility from the enforcement suite is assessed as moderate and concentrated in CPF-02. The CAATSA/CISADA secondary sanctions framework, maritime de-flagging enforcement mechanism, and semiconductor supply chain chokepoint analysis directly address Russian evasion infrastructure. The Principal Legal Risks sections for maritime de-flagging and secondary sanctions disclose the specific legal vulnerabilities Russia’s legal counsel could exploit (registry sovereignty, proportionality, diplomatic escalation leverage). The NUC-01 HALEU supply chain analysis also identifies Russian leverage points in the U.S. nuclear fuel cycle (Rosatom/TENEX dependence).</w:t>
       </w:r>
     </w:p>
     <w:p>
@@ -1861,7 +1966,66 @@
           <w:sz w:val="20"/>
           <w:szCs w:val="20"/>
         </w:rPr>
-        <w:t xml:space="preserve">Moderate-High. The PRC maintains the most sophisticated legal defense infrastructure among assessed adversaries and is the most likely to operationalize the litigation vulnerability map systematically. PRC legal teams preparing for § 981(k) actions against state-owned banks would find the FSIA sovereign immunity analysis, the anti-sanctions legislation defense mapping, and the institutional throughput constraints directly useful for pre-positioning legal defenses. The enforcement suite aggregates and structures analysis that PRC counsel could develop independently, but accelerates and focuses that preparation.</w:t>
+        <w:t xml:space="preserve">Moderate. CPF-02 litigation risks and evasion pathway analysis are the highest-value content. NUC-01 HALEU analysis confirms publicly reported dependence.</w:t>
+      </w:r>
+    </w:p>
+    <w:p>
+      <w:pPr>
+        <w:pStyle w:val="Heading2"/>
+        <w:spacing w:after="160" w:before="280"/>
+      </w:pPr>
+      <w:r>
+        <w:rPr>
+          <w:rFonts w:ascii="Arial" w:cs="Arial" w:eastAsia="Arial" w:hAnsi="Arial"/>
+          <w:b/>
+          <w:bCs/>
+          <w:color w:val="1B2A4A"/>
+          <w:sz w:val="24"/>
+          <w:szCs w:val="24"/>
+        </w:rPr>
+        <w:t xml:space="preserve">2.2 People’s Republic of China — MSS</w:t>
+      </w:r>
+    </w:p>
+    <w:p>
+      <w:pPr>
+        <w:spacing w:after="120" w:line="276"/>
+      </w:pPr>
+      <w:r>
+        <w:rPr>
+          <w:rFonts w:ascii="Arial" w:cs="Arial" w:eastAsia="Arial" w:hAnsi="Arial"/>
+          <w:sz w:val="22"/>
+          <w:szCs w:val="22"/>
+        </w:rPr>
+        <w:t xml:space="preserve">PRC adversary utility is assessed as moderate and concentrated in the enforcement suite’s treatment of PRC-domiciled banks. ARCH-03 and CPF-02 explicitly analyze § 981(k) asset substitution authority against PRC correspondent accounts, FSIA sovereign immunity defenses for PRC state-owned banks, and PRC anti-sanctions legislation as a conflict-of-law defense. The Key Unknowns sections explicitly identify PRC enforcement cooperation thresholds and secondary sanctions absorption capacity as unestablished — disclosing the precise uncertainty boundary the U.S. enforcement architecture cannot resolve from public sources.</w:t>
+      </w:r>
+    </w:p>
+    <w:p>
+      <w:pPr>
+        <w:pBdr>
+          <w:left w:val="single" w:color="7A4000" w:sz="12" w:space="8"/>
+        </w:pBdr>
+        <w:shd w:fill="FEF3E2" w:val="clear"/>
+        <w:spacing w:after="200" w:before="200" w:line="276"/>
+        <w:ind w:left="200" w:right="200"/>
+      </w:pPr>
+      <w:r>
+        <w:rPr>
+          <w:rFonts w:ascii="Arial" w:cs="Arial" w:eastAsia="Arial" w:hAnsi="Arial"/>
+          <w:b/>
+          <w:bCs/>
+          <w:color w:val="7A4000"/>
+          <w:sz w:val="20"/>
+          <w:szCs w:val="20"/>
+        </w:rPr>
+        <w:t xml:space="preserve">ASSESSED UTILITY: </w:t>
+      </w:r>
+      <w:r>
+        <w:rPr>
+          <w:rFonts w:ascii="Arial" w:cs="Arial" w:eastAsia="Arial" w:hAnsi="Arial"/>
+          <w:sz w:val="20"/>
+          <w:szCs w:val="20"/>
+        </w:rPr>
+        <w:t xml:space="preserve">Moderate-High. The PRC maintains the most sophisticated legal defense infrastructure among assessed adversaries and is the most likely to operationalize the litigation vulnerability map systematically. PRC legal teams preparing for § 981(k) actions against state-owned banks would find the FSIA sovereign immunity analysis, the anti-sanctions legislation defense mapping, and the institutional throughput constraints directly useful for pre-positioning legal defenses. The enforcement suite aggregates and structures analysis that PRC counsel could develop independently, but accelerates and focuses that preparation. STRAT-NSCC-01 adds a distinct PRC-specific exposure layer: the memorandum explicitly identifies enforcement recalibration actions targeting PRC defense-industrial procurement networks, names priority transshipment jurisdictions, and discloses the decision matrix timelines that define the U.S. enforcement response tempo. PRC procurement network operators reading STRAT-NSCC-01 would receive advance notice of the enforcement actions most likely to be pursued and the approximate timelines for implementation, enabling pre-emptive network restructuring. The mitigant is that the recommended actions operate through structural legal authority and would be publicly visible at implementation.</w:t>
       </w:r>
     </w:p>
     <w:p>
@@ -3425,6 +3589,188 @@
           </w:p>
         </w:tc>
       </w:tr>
+      <w:tr>
+        <w:tc>
+          <w:tcPr>
+            <w:tcW w:type="dxa" w:w="1600"/>
+            <w:tcBorders>
+              <w:top w:val="single" w:color="CCCCCC" w:sz="1"/>
+              <w:left w:val="single" w:color="CCCCCC" w:sz="1"/>
+              <w:bottom w:val="single" w:color="CCCCCC" w:sz="1"/>
+              <w:right w:val="single" w:color="CCCCCC" w:sz="1"/>
+            </w:tcBorders>
+            <w:tcMar>
+              <w:top w:type="dxa" w:w="80"/>
+              <w:left w:type="dxa" w:w="120"/>
+              <w:bottom w:type="dxa" w:w="80"/>
+              <w:right w:type="dxa" w:w="120"/>
+            </w:tcMar>
+          </w:tcPr>
+          <w:p>
+            <w:pPr>
+              <w:spacing w:after="40"/>
+            </w:pPr>
+            <w:r>
+              <w:rPr>
+                <w:rFonts w:ascii="Arial" w:cs="Arial" w:eastAsia="Arial" w:hAnsi="Arial"/>
+                <w:sz w:val="20"/>
+                <w:szCs w:val="20"/>
+              </w:rPr>
+              <w:t xml:space="preserve">STRAT-NSCC-01</w:t>
+            </w:r>
+          </w:p>
+        </w:tc>
+        <w:tc>
+          <w:tcPr>
+            <w:tcW w:type="dxa" w:w="1600"/>
+            <w:tcBorders>
+              <w:top w:val="single" w:color="CCCCCC" w:sz="1"/>
+              <w:left w:val="single" w:color="CCCCCC" w:sz="1"/>
+              <w:bottom w:val="single" w:color="CCCCCC" w:sz="1"/>
+              <w:right w:val="single" w:color="CCCCCC" w:sz="1"/>
+            </w:tcBorders>
+            <w:tcMar>
+              <w:top w:type="dxa" w:w="80"/>
+              <w:left w:type="dxa" w:w="120"/>
+              <w:bottom w:type="dxa" w:w="80"/>
+              <w:right w:type="dxa" w:w="120"/>
+            </w:tcMar>
+          </w:tcPr>
+          <w:p>
+            <w:pPr>
+              <w:spacing w:after="40"/>
+            </w:pPr>
+            <w:r>
+              <w:rPr>
+                <w:rFonts w:ascii="Arial" w:cs="Arial" w:eastAsia="Arial" w:hAnsi="Arial"/>
+                <w:sz w:val="20"/>
+                <w:szCs w:val="20"/>
+              </w:rPr>
+              <w:t xml:space="preserve">Enforcement calibration + source ceiling</w:t>
+            </w:r>
+          </w:p>
+        </w:tc>
+        <w:tc>
+          <w:tcPr>
+            <w:tcW w:type="dxa" w:w="2080"/>
+            <w:tcBorders>
+              <w:top w:val="single" w:color="CCCCCC" w:sz="1"/>
+              <w:left w:val="single" w:color="CCCCCC" w:sz="1"/>
+              <w:bottom w:val="single" w:color="CCCCCC" w:sz="1"/>
+              <w:right w:val="single" w:color="CCCCCC" w:sz="1"/>
+            </w:tcBorders>
+            <w:tcMar>
+              <w:top w:type="dxa" w:w="80"/>
+              <w:left w:type="dxa" w:w="120"/>
+              <w:bottom w:type="dxa" w:w="80"/>
+              <w:right w:type="dxa" w:w="120"/>
+            </w:tcMar>
+          </w:tcPr>
+          <w:p>
+            <w:pPr>
+              <w:spacing w:after="40"/>
+            </w:pPr>
+            <w:r>
+              <w:rPr>
+                <w:rFonts w:ascii="Arial" w:cs="Arial" w:eastAsia="Arial" w:hAnsi="Arial"/>
+                <w:sz w:val="20"/>
+                <w:szCs w:val="20"/>
+              </w:rPr>
+              <w:t xml:space="preserve">Decision matrix timelines, transshipment node prioritization, source reliability disclosure</w:t>
+            </w:r>
+          </w:p>
+        </w:tc>
+        <w:tc>
+          <w:tcPr>
+            <w:tcW w:type="dxa" w:w="1040"/>
+            <w:tcBorders>
+              <w:top w:val="single" w:color="CCCCCC" w:sz="1"/>
+              <w:left w:val="single" w:color="CCCCCC" w:sz="1"/>
+              <w:bottom w:val="single" w:color="CCCCCC" w:sz="1"/>
+              <w:right w:val="single" w:color="CCCCCC" w:sz="1"/>
+            </w:tcBorders>
+            <w:tcMar>
+              <w:top w:type="dxa" w:w="80"/>
+              <w:left w:type="dxa" w:w="120"/>
+              <w:bottom w:type="dxa" w:w="80"/>
+              <w:right w:type="dxa" w:w="120"/>
+            </w:tcMar>
+          </w:tcPr>
+          <w:p>
+            <w:pPr>
+              <w:spacing w:after="40"/>
+            </w:pPr>
+            <w:r>
+              <w:rPr>
+                <w:rFonts w:ascii="Arial" w:cs="Arial" w:eastAsia="Arial" w:hAnsi="Arial"/>
+                <w:sz w:val="20"/>
+                <w:szCs w:val="20"/>
+              </w:rPr>
+              <w:t xml:space="preserve">MOD</w:t>
+            </w:r>
+          </w:p>
+        </w:tc>
+        <w:tc>
+          <w:tcPr>
+            <w:tcW w:type="dxa" w:w="1040"/>
+            <w:tcBorders>
+              <w:top w:val="single" w:color="CCCCCC" w:sz="1"/>
+              <w:left w:val="single" w:color="CCCCCC" w:sz="1"/>
+              <w:bottom w:val="single" w:color="CCCCCC" w:sz="1"/>
+              <w:right w:val="single" w:color="CCCCCC" w:sz="1"/>
+            </w:tcBorders>
+            <w:tcMar>
+              <w:top w:type="dxa" w:w="80"/>
+              <w:left w:type="dxa" w:w="120"/>
+              <w:bottom w:type="dxa" w:w="80"/>
+              <w:right w:type="dxa" w:w="120"/>
+            </w:tcMar>
+          </w:tcPr>
+          <w:p>
+            <w:pPr>
+              <w:spacing w:after="40"/>
+            </w:pPr>
+            <w:r>
+              <w:rPr>
+                <w:rFonts w:ascii="Arial" w:cs="Arial" w:eastAsia="Arial" w:hAnsi="Arial"/>
+                <w:sz w:val="20"/>
+                <w:szCs w:val="20"/>
+              </w:rPr>
+              <w:t xml:space="preserve">MOD</w:t>
+            </w:r>
+          </w:p>
+        </w:tc>
+        <w:tc>
+          <w:tcPr>
+            <w:tcW w:type="dxa" w:w="2000"/>
+            <w:tcBorders>
+              <w:top w:val="single" w:color="CCCCCC" w:sz="1"/>
+              <w:left w:val="single" w:color="CCCCCC" w:sz="1"/>
+              <w:bottom w:val="single" w:color="CCCCCC" w:sz="1"/>
+              <w:right w:val="single" w:color="CCCCCC" w:sz="1"/>
+            </w:tcBorders>
+            <w:tcMar>
+              <w:top w:type="dxa" w:w="80"/>
+              <w:left w:type="dxa" w:w="120"/>
+              <w:bottom w:type="dxa" w:w="80"/>
+              <w:right w:type="dxa" w:w="120"/>
+            </w:tcMar>
+          </w:tcPr>
+          <w:p>
+            <w:pPr>
+              <w:spacing w:after="40"/>
+            </w:pPr>
+            <w:r>
+              <w:rPr>
+                <w:rFonts w:ascii="Arial" w:cs="Arial" w:eastAsia="Arial" w:hAnsi="Arial"/>
+                <w:sz w:val="20"/>
+                <w:szCs w:val="20"/>
+              </w:rPr>
+              <w:t xml:space="preserve">PRC procurement network adaptation; enforcement tempo calibration</w:t>
+            </w:r>
+          </w:p>
+        </w:tc>
+      </w:tr>
     </w:tbl>
     <w:p>
       <w:pPr>
@@ -3469,7 +3815,7 @@
           <w:sz w:val="22"/>
           <w:szCs w:val="22"/>
         </w:rPr>
-        <w:t xml:space="preserve">The legal exposure determination for all six documents is identical to WP-2026-CI-Assessment v3.0. The following summarizes the key determinations by reference.</w:t>
+        <w:t xml:space="preserve">The legal exposure determination for all seven documents is identical to WP-2026-CI-Assessment v3.0. The following summarizes the key determinations by reference.</w:t>
       </w:r>
     </w:p>
     <w:p>
@@ -3541,7 +3887,7 @@
           <w:sz w:val="22"/>
           <w:szCs w:val="22"/>
         </w:rPr>
-        <w:t xml:space="preserve">First Amendment: Fully protective. All six documents constitute protected academic and policy commentary on matters of public concern. Snyder v. Phelps protections apply at the highest level.</w:t>
+        <w:t xml:space="preserve">First Amendment: Fully protective. All seven documents constitute protected academic and policy commentary on matters of public concern. Snyder v. Phelps protections apply at the highest level.</w:t>
       </w:r>
     </w:p>
     <w:p>
@@ -3570,7 +3916,7 @@
           <w:sz w:val="20"/>
           <w:szCs w:val="20"/>
         </w:rPr>
-        <w:t xml:space="preserve">Every analytical claim in all six documents is derived from publicly available sources: enacted statutes, published executive orders, OFAC designation records, DOJ enforcement actions, FinCEN press releases, DOE/EIA/NRC reporting, CISA/GAO assessments, and open-source policy analysis. The enforcement architecture is the author’s analytical work product synthesizing public legal authorities. Proactive disclosure of these documents in SF-86 and adjudication proceedings is recommended, consistent with WP-2026-CI-Assessment v3.0 Section 4.6.</w:t>
+        <w:t xml:space="preserve">Every analytical claim in all seven documents is derived from publicly available sources: enacted statutes, published executive orders, OFAC designation records, DOJ enforcement actions, FinCEN press releases, DOE/EIA/NRC reporting, CISA/GAO assessments, and open-source policy analysis. The enforcement architecture is the author’s analytical work product synthesizing public legal authorities. Proactive disclosure of these documents in SF-86 and adjudication proceedings is recommended, consistent with WP-2026-CI-Assessment v3.0 Section 4.6.</w:t>
       </w:r>
     </w:p>
     <w:p>
@@ -3622,7 +3968,7 @@
           <w:sz w:val="22"/>
           <w:szCs w:val="22"/>
         </w:rPr>
-        <w:t xml:space="preserve">No retraction recommended. The enforcement architecture documents are published, indexed, and should be treated as already collected. Retraction carries no CI benefit and significant academic and professional cost.</w:t>
+        <w:t xml:space="preserve">No retraction recommended. The enforcement architecture documents and STRAT-NSCC-01 are published, indexed, and should be treated as already collected. Retraction carries no CI benefit and significant academic and professional cost.</w:t>
       </w:r>
     </w:p>
     <w:p>
@@ -3688,7 +4034,7 @@
           <w:sz w:val="22"/>
           <w:szCs w:val="22"/>
         </w:rPr>
-        <w:t xml:space="preserve">The legal exposure determination (Part IV) establishes that no content in any of the six documents implicates any criminal statute or clearance-disqualifying act. Proactive disclosure of the enforcement architecture series, the GitHub repository, and all CI assessments (CI-Assessment v3.0, MAP-CI-01, and this document) in SF-86 and adjudication proceedings is recommended. The production of standalone CI exposure assessments of one’s own published work is the marker of the security discipline that adjudicative guidelines assess favorably under the whole-person standard.</w:t>
+        <w:t xml:space="preserve">The legal exposure determination (Part IV) establishes that no content in any of the six documents implicates any criminal statute or clearance-disqualifying act. Proactive disclosure of the enforcement architecture series, STRAT-NSCC-01, the GitHub repository, and all CI assessments (CI-Assessment v3.0, MAP-CI-01, and this document) in SF-86 and adjudication proceedings is recommended. The production of standalone CI exposure assessments of one’s own published work is the marker of the security discipline that adjudicative guidelines assess favorably under the whole-person standard.</w:t>
       </w:r>
     </w:p>
     <w:p>
@@ -3718,7 +4064,7 @@
           <w:sz w:val="22"/>
           <w:szCs w:val="22"/>
         </w:rPr>
-        <w:t xml:space="preserve">The enforcement architecture series demonstrates institutional-grade legal-operational analytical capability at a register consistent with senior analyst or attorney-advisor positions at Treasury, DOJ, or ODNI. The CI self-assessment posture — producing this document alongside the enforcement suite — demonstrates the professional judgment and operational security awareness the program selects for.</w:t>
+        <w:t xml:space="preserve">The enforcement architecture series and STRAT-NSCC-01 demonstrate institutional-grade legal-operational analytical capability at a register consistent with senior analyst or attorney-advisor positions at Treasury, DOJ, or ODNI. STRAT-NSCC-01 additionally demonstrates event-driven policy response capability — the ability to translate a breaking intelligence event into a structured, authority-mapped enforcement calibration memorandum with interagency synchronization logic. The CI self-assessment posture — producing this document alongside the enforcement suite — demonstrates the professional judgment and operational security awareness the program selects for.</w:t>
       </w:r>
     </w:p>
     <w:p>
@@ -3764,7 +4110,7 @@
           <w:sz w:val="20"/>
           <w:szCs w:val="20"/>
         </w:rPr>
-        <w:t xml:space="preserve">Available evidence supports the judgment that the enforcement architecture series’ CI exposure profile is acceptable and consistent with the open-source publication posture of the WP-2026 series. The enforcement mechanisms described in the suite operate through structural legal authority and institutional capacity, not information asymmetry. This CI assessment’s own exposure rankings and adversary utility ratings constitute a prioritization guide for adversary collection focus; this reflexivity is inherent to any published CI self-assessment and does not alter the acceptability determination. Knowing the enforcement logic does not transfer the OFAC designation authority, DOJ prosecutorial discretion, BIS export control jurisdiction, or secondary sanctions enforcement capacity required to execute enforcement action. The legal exposure is very low. The academic, professional, and demonstration value is very high. The CI self-assessment posture is the correct professional response. [MODERATE CONFIDENCE, ANALYTICALLY INFERRED]</w:t>
+        <w:t xml:space="preserve">Available evidence supports the judgment that the enforcement architecture series’ CI exposure profile is acceptable and consistent with the open-source publication posture of the WP-2026 series. STRAT-NSCC-01’s addition to the corpus introduces a moderate-level exposure increment concentrated in PRC-specific enforcement calibration logic and transshipment node identification, but this exposure is mitigated by the document’s structural legal authority framing and its transparent source reliability disclosure. The enforcement mechanisms described in the suite operate through structural legal authority and institutional capacity, not information asymmetry. This CI assessment’s own exposure rankings and adversary utility ratings constitute a prioritization guide for adversary collection focus; this reflexivity is inherent to any published CI self-assessment and does not alter the acceptability determination. Knowing the enforcement logic does not transfer the OFAC designation authority, DOJ prosecutorial discretion, BIS export control jurisdiction, or secondary sanctions enforcement capacity required to execute enforcement action. The legal exposure is very low. The academic, professional, and demonstration value is very high. The CI self-assessment posture is the correct professional response. [MODERATE CONFIDENCE, ANALYTICALLY INFERRED]</w:t>
       </w:r>
     </w:p>
     <w:p>

</xml_diff>